<commit_message>
docs: document status-change history and All Sky sensor overlay
Cover the two features added in the previous commit: status_history.json
persisting the true last-change time behind every dashboard "Previously
..." line across restarts, and the All Sky sensor-info overlay - both
this service's own drawn version and Allsky's native Extra Text File
integration, including the Section 5.3 field descriptions, a new
Troubleshooting FAQ entry for the case where Allsky isn't picking up
the readings, and two new Appendix rows for the files these features
create.

Co-Authored-By: Claude Sonnet 5 <noreply@anthropic.com>
Claude-Session: https://claude.ai/code/session_01BoDyn1TXaNEhBU2sENEj1a
</commit_message>
<xml_diff>
--- a/Observatory_Setup_Guide.docx
+++ b/Observatory_Setup_Guide.docx
@@ -2161,7 +2161,7 @@
         <w:spacing w:after="160" w:line="300"/>
       </w:pPr>
       <w:r>
-        <w:t xml:space="preserve">Shows the overall SAFE/UNSAFE badge, the manual override buttons, and every individual check with a colored status dot (green = passing or disabled, red = actively failing). A "Previously …" line under each reading shows when it last changed.</w:t>
+        <w:t xml:space="preserve">Shows the overall SAFE/UNSAFE badge, the manual override buttons, and every individual check with a colored status dot (green = passing or disabled, red = actively failing). A "Previously …" line under each reading shows when it last changed. This is tracked in status_history.json next to the service file, so it reflects the true last-change time even across a service restart, not just since the service happened to last start up.</w:t>
       </w:r>
     </w:p>
     <w:p>
@@ -2413,7 +2413,7 @@
         <w:spacing w:after="160" w:line="300"/>
       </w:pPr>
       <w:r>
-        <w:t xml:space="preserve">Shows the latest frame from your all-sky camera once enabled under Settings → All Sky Camera (Section 5.3).</w:t>
+        <w:t xml:space="preserve">Shows the latest frame from your all-sky camera once enabled under Settings → All Sky Camera (Section 5.3). Optionally overlays the current sensor readings — outside/box temperature and humidity, Sky state, Rain, ML Cloud class, and overall SAFE/UNSAFE — directly on the image, either drawn by this service itself or fed to Allsky's own overlay via a shared text file (see Section 5.3).</w:t>
       </w:r>
     </w:p>
     <w:p>
@@ -2633,7 +2633,7 @@
         <w:spacing w:after="160" w:line="300"/>
       </w:pPr>
       <w:r>
-        <w:t xml:space="preserve">Dome &amp; Heater are master on/off switches for each whole subsystem — turn one off if you don't have that hardware at all (e.g. no motorized roof). All Sky Camera points the dashboard at your camera's latest frame, either a local file path on the Pi or an http(s):// URL from another device's own all-sky web server.</w:t>
+        <w:t xml:space="preserve">Dome &amp; Heater are master on/off switches for each whole subsystem — turn one off if you don't have that hardware at all (e.g. no motorized roof). All Sky Camera points the dashboard at your camera's latest frame, either a local file path on the Pi or an http(s):// URL from another device's own all-sky web server. Two more All Sky fields feed a sensor-info overlay onto the image: the Extra Text File path, where this service writes the current readings (one per line) every poll cycle — paste the exact same path into Allsky's own Settings → Overlay → "Extra Text File" field so Allsky bakes them into every frame it captures — and a checkbox to skip this service's own drawn overlay once Allsky's is doing that job, so you don't end up with two overlapping info boxes.</w:t>
       </w:r>
     </w:p>
     <w:p>
@@ -3162,7 +3162,7 @@
         <w:spacing w:after="160" w:line="300"/>
       </w:pPr>
       <w:r>
-        <w:t xml:space="preserve">The Logs page (linked from the top of the dashboard) records every safety-relevant change: sensor connect/disconnect, individual check flips, overall SAFE/UNSAFE transitions, dome and heater actions, manual overrides, and settings changes. Log text rotates to a new file every week; filter by week, category, or a text search, and click a thumbnail to see the All Sky snapshot attached to that entry (when one was captured).</w:t>
+        <w:t xml:space="preserve">The Logs page (linked from the top of the dashboard) records every safety-relevant change: sensor connect/disconnect, individual check flips, overall SAFE/UNSAFE transitions, dome and heater actions, manual overrides, and settings changes. Log text rotates to a new file every week; filter by week, category, or a text search, and click a thumbnail to see the All Sky snapshot attached to that entry (when one was captured) — which, if the sensor-info overlay is enabled, also carries the readings that were current at that moment.</w:t>
       </w:r>
     </w:p>
     <w:p>
@@ -3907,6 +3907,28 @@
       </w:r>
     </w:p>
     <w:p>
+      <w:pPr>
+        <w:pStyle w:val="Heading3"/>
+        <w:spacing w:after="100" w:before="220"/>
+      </w:pPr>
+      <w:r>
+        <w:rPr>
+          <w:b/>
+          <w:bCs/>
+          <w:color w:val="2F6F4E"/>
+        </w:rPr>
+        <w:t xml:space="preserve">I set the Extra Text File path but Allsky isn't showing my sensor readings</w:t>
+      </w:r>
+    </w:p>
+    <w:p>
+      <w:pPr>
+        <w:spacing w:after="160" w:line="300"/>
+      </w:pPr>
+      <w:r>
+        <w:t xml:space="preserve">Check three things. First, the exact same full path must be entered in both places — this service's Settings → All Sky Camera → Extra Text File path, and Allsky's own Settings → Overlay → "Extra Text File" field. Second, that path has to match where dome_safety_service.py actually runs from on your Pi — run "sudo systemctl status dome-safety.service" if you're not sure of the real folder (a common gotcha: this service's default path assumes a "pi" login user, but your Pi may use a different one, e.g. admin, which changes the home directory). Third, the service has to have been restarted since you set the path ("sudo systemctl restart dome-safety.service"). You can confirm the file itself is updating by running "cat &lt;the path&gt;" directly on the Pi — its first line (a timestamp) should advance every couple of seconds.</w:t>
+      </w:r>
+    </w:p>
+    <w:p>
       <w:r>
         <w:br w:type="page"/>
       </w:r>
@@ -4113,7 +4135,7 @@
                 <w:sz w:val="20"/>
                 <w:szCs w:val="20"/>
               </w:rPr>
-              <w:t xml:space="preserve">Event logs</w:t>
+              <w:t xml:space="preserve">Status-change history</w:t>
             </w:r>
           </w:p>
         </w:tc>
@@ -4136,7 +4158,7 @@
                 <w:sz w:val="20"/>
                 <w:szCs w:val="20"/>
               </w:rPr>
-              <w:t xml:space="preserve">logs/ (one week-*.jsonl file per week), next to the service file</w:t>
+              <w:t xml:space="preserve">status_history.json, created automatically next to the service file — the true last-change time behind every "Previously …" line, so it survives a service restart</w:t>
             </w:r>
           </w:p>
         </w:tc>
@@ -4161,7 +4183,7 @@
                 <w:sz w:val="20"/>
                 <w:szCs w:val="20"/>
               </w:rPr>
-              <w:t xml:space="preserve">All Sky log snapshots</w:t>
+              <w:t xml:space="preserve">Event logs</w:t>
             </w:r>
           </w:p>
         </w:tc>
@@ -4184,7 +4206,7 @@
                 <w:sz w:val="20"/>
                 <w:szCs w:val="20"/>
               </w:rPr>
-              <w:t xml:space="preserve">logs/images/, next to the service file</w:t>
+              <w:t xml:space="preserve">logs/ (one week-*.jsonl file per week), next to the service file</w:t>
             </w:r>
           </w:p>
         </w:tc>
@@ -4209,6 +4231,102 @@
                 <w:sz w:val="20"/>
                 <w:szCs w:val="20"/>
               </w:rPr>
+              <w:t xml:space="preserve">All Sky log snapshots</w:t>
+            </w:r>
+          </w:p>
+        </w:tc>
+        <w:tc>
+          <w:tcPr>
+            <w:tcW w:type="dxa" w:w="6160"/>
+            <w:tcMar>
+              <w:top w:type="dxa" w:w="80"/>
+              <w:left w:type="dxa" w:w="120"/>
+              <w:bottom w:type="dxa" w:w="80"/>
+              <w:right w:type="dxa" w:w="120"/>
+            </w:tcMar>
+          </w:tcPr>
+          <w:p>
+            <w:r>
+              <w:rPr>
+                <w:b w:val="false"/>
+                <w:bCs w:val="false"/>
+                <w:color w:val="222222"/>
+                <w:sz w:val="20"/>
+                <w:szCs w:val="20"/>
+              </w:rPr>
+              <w:t xml:space="preserve">logs/images/, next to the service file</w:t>
+            </w:r>
+          </w:p>
+        </w:tc>
+      </w:tr>
+      <w:tr>
+        <w:tc>
+          <w:tcPr>
+            <w:tcW w:type="dxa" w:w="3200"/>
+            <w:tcMar>
+              <w:top w:type="dxa" w:w="80"/>
+              <w:left w:type="dxa" w:w="120"/>
+              <w:bottom w:type="dxa" w:w="80"/>
+              <w:right w:type="dxa" w:w="120"/>
+            </w:tcMar>
+          </w:tcPr>
+          <w:p>
+            <w:r>
+              <w:rPr>
+                <w:b w:val="false"/>
+                <w:bCs w:val="false"/>
+                <w:color w:val="222222"/>
+                <w:sz w:val="20"/>
+                <w:szCs w:val="20"/>
+              </w:rPr>
+              <w:t xml:space="preserve">Allsky Extra Text File</w:t>
+            </w:r>
+          </w:p>
+        </w:tc>
+        <w:tc>
+          <w:tcPr>
+            <w:tcW w:type="dxa" w:w="6160"/>
+            <w:tcMar>
+              <w:top w:type="dxa" w:w="80"/>
+              <w:left w:type="dxa" w:w="120"/>
+              <w:bottom w:type="dxa" w:w="80"/>
+              <w:right w:type="dxa" w:w="120"/>
+            </w:tcMar>
+          </w:tcPr>
+          <w:p>
+            <w:r>
+              <w:rPr>
+                <w:b w:val="false"/>
+                <w:bCs w:val="false"/>
+                <w:color w:val="222222"/>
+                <w:sz w:val="20"/>
+                <w:szCs w:val="20"/>
+              </w:rPr>
+              <w:t xml:space="preserve">Wherever you set it under Settings → All Sky Camera → Extra Text File path (default: allsky_extra.txt next to the service file) — rewritten every poll cycle for Allsky's own overlay to read</w:t>
+            </w:r>
+          </w:p>
+        </w:tc>
+      </w:tr>
+      <w:tr>
+        <w:tc>
+          <w:tcPr>
+            <w:tcW w:type="dxa" w:w="3200"/>
+            <w:tcMar>
+              <w:top w:type="dxa" w:w="80"/>
+              <w:left w:type="dxa" w:w="120"/>
+              <w:bottom w:type="dxa" w:w="80"/>
+              <w:right w:type="dxa" w:w="120"/>
+            </w:tcMar>
+          </w:tcPr>
+          <w:p>
+            <w:r>
+              <w:rPr>
+                <w:b w:val="false"/>
+                <w:bCs w:val="false"/>
+                <w:color w:val="222222"/>
+                <w:sz w:val="20"/>
+                <w:szCs w:val="20"/>
+              </w:rPr>
               <w:t xml:space="preserve">systemd unit file</w:t>
             </w:r>
           </w:p>
@@ -4243,7 +4361,7 @@
         <w:spacing w:after="160" w:line="300"/>
       </w:pPr>
       <w:r>
-        <w:t xml:space="preserve">dome_config.json and the logs/ folder are both created automatically on first run and are safe to delete if you ever want to reset all settings and log history back to defaults — the service recreates them with default values the next time it starts.</w:t>
+        <w:t xml:space="preserve">dome_config.json and the logs/ folder are both created automatically on first run and are safe to delete if you ever want to reset all settings and log history back to defaults — the service recreates them with default values the next time it starts. status_history.json works the same way — delete it if you ever want the "Previously …" lines to start fresh.</w:t>
       </w:r>
     </w:p>
     <w:sectPr>

</xml_diff>

<commit_message>
docs(ai-learning): document setup and usage
- README: add an "AI Learning (optional)" subsection describing the
  capture/classify/train workflow and the fail-open fifth SafetyMonitor
  gate, cross-referencing the setup guide.
- Setup guide: add Section 5.9 (AI Learning settings), a new Section 10
  walkthrough (train and enable the model, fail-open behavior),
  renumber old Section 10 (Troubleshooting & FAQ) to Section 11, add
  two FAQ entries for the model/banner, and an Appendix row for
  ai_training/.

Co-Authored-By: Claude Sonnet 5 <noreply@anthropic.com>
Claude-Session: https://claude.ai/code/session_01BoDyn1TXaNEhBU2sENEj1a
</commit_message>
<xml_diff>
--- a/Observatory_Setup_Guide.docx
+++ b/Observatory_Setup_Guide.docx
@@ -126,7 +126,7 @@
         <w:t xml:space="preserve">SafetyMonitor</w:t>
       </w:r>
       <w:r>
-        <w:t xml:space="preserve"> — fuses four independent, individually-toggleable checks with fail-safe logic (any one can veto SAFE, and an unreachable/stale sensor counts as UNSAFE): Day/Night (from solar elevation), Rain, an MLX90614 ambient-vs-sky clear/cloud delta, and Simple Cloud Detect's ML sky classification from an all-sky camera feed. A manual Force-SAFE / Force-UNSAFE override can bypass all four at once.</w:t>
+        <w:t xml:space="preserve"> — fuses four independent, individually-toggleable checks with fail-safe logic (any one can veto SAFE, and an unreachable/stale sensor counts as UNSAFE): Day/Night (from solar elevation), Rain, an MLX90614 ambient-vs-sky clear/cloud delta, and Simple Cloud Detect's ML sky classification from an all-sky camera feed. An optional fifth AI Model check (off by default; see Section 10) adds your own trained sky-condition model to the decision once you trust it, and fails open — never blocking SAFE — if it's turned on before a model exists or with no fresh reading to predict from. A manual Force-SAFE / Force-UNSAFE override can bypass all five at once.</w:t>
       </w:r>
     </w:p>
     <w:p>
@@ -206,7 +206,27 @@
         <w:t xml:space="preserve">Web dashboard &amp; Settings</w:t>
       </w:r>
       <w:r>
-        <w:t xml:space="preserve"> — live status at all times, plus a Settings page covering location/timezone, safety checks, schedule, hardware pins/addresses, sensor and ASCOM device names, the All Sky camera, and log retention.</w:t>
+        <w:t xml:space="preserve"> — live status at all times, plus a Settings page covering location/timezone, safety checks, schedule, hardware pins/addresses, sensor and ASCOM device names, the All Sky camera, AI Learning, and log retention.</w:t>
+      </w:r>
+    </w:p>
+    <w:p>
+      <w:pPr>
+        <w:pStyle w:val="ListParagraph"/>
+        <w:numPr>
+          <w:ilvl w:val="0"/>
+          <w:numId w:val="2"/>
+        </w:numPr>
+        <w:spacing w:after="100" w:line="280"/>
+      </w:pPr>
+      <w:r>
+        <w:rPr>
+          <w:b/>
+          <w:bCs/>
+        </w:rPr>
+        <w:t xml:space="preserve">AI Learning</w:t>
+      </w:r>
+      <w:r>
+        <w:t xml:space="preserve"> — captures raw All Sky frames and sensor readings on a timer, lets you manually classify them, trains a from-scratch sky-condition model from those classifications, and can feed that model into the SafetyMonitor's fifth check above once you trust it (Section 10).</w:t>
       </w:r>
     </w:p>
     <w:p>
@@ -3142,6 +3162,71 @@
     </w:p>
     <w:p>
       <w:pPr>
+        <w:pStyle w:val="Heading2"/>
+        <w:spacing w:after="140" w:before="340"/>
+      </w:pPr>
+      <w:r>
+        <w:rPr>
+          <w:b/>
+          <w:bCs/>
+          <w:color w:val="1F3A5F"/>
+        </w:rPr>
+        <w:t xml:space="preserve">5.9 AI Learning</w:t>
+      </w:r>
+    </w:p>
+    <w:p>
+      <w:pPr>
+        <w:spacing w:after="160" w:line="300"/>
+      </w:pPr>
+      <w:r>
+        <w:t xml:space="preserve">Two separate switches drive this feature, and turning one on never turns the other on for you. </w:t>
+      </w:r>
+      <w:r>
+        <w:rPr>
+          <w:b/>
+          <w:bCs/>
+        </w:rPr>
+        <w:t xml:space="preserve">Enable AI Learning data capture</w:t>
+      </w:r>
+      <w:r>
+        <w:t xml:space="preserve"> starts saving a raw All Sky frame plus a full sensor snapshot on a timer (default every 15 minutes) — but only while All Sky Camera (Section 5.3) is also enabled and configured, since there is nothing to capture otherwise. Unlabeled samples older than the configured retention (default 45 days; 0 = never) are cleaned up automatically; once a sample is classified it's kept regardless of age. The classification labels list here (default: Clear, Partly Cloudy, Mostly Cloudy, Overcast, Rain, Snow, Freezing Rain, Ignore) is what shows up as buttons on the Classify page, and can be edited any time.</w:t>
+      </w:r>
+    </w:p>
+    <w:p>
+      <w:pPr>
+        <w:spacing w:after="160" w:line="300"/>
+      </w:pPr>
+      <w:r>
+        <w:t xml:space="preserve">Separately, </w:t>
+      </w:r>
+      <w:r>
+        <w:rPr>
+          <w:b/>
+          <w:bCs/>
+        </w:rPr>
+        <w:t xml:space="preserve">Use the trained model in the SAFE/UNSAFE decision</w:t>
+      </w:r>
+      <w:r>
+        <w:t xml:space="preserve"> turns on the optional fifth SafetyMonitor check mentioned in Section 1, and </w:t>
+      </w:r>
+      <w:r>
+        <w:rPr>
+          <w:b/>
+          <w:bCs/>
+        </w:rPr>
+        <w:t xml:space="preserve">Predicted labels that count as SAFE</w:t>
+      </w:r>
+      <w:r>
+        <w:t xml:space="preserve"> (default: just Clear) decides which of the model’s possible predictions actually pass that check. See Section 10 for the full workflow — capturing, classifying, training, and exactly what happens if this is turned on before a model exists.</w:t>
+      </w:r>
+    </w:p>
+    <w:p>
+      <w:r>
+        <w:br w:type="page"/>
+      </w:r>
+    </w:p>
+    <w:p>
+      <w:pPr>
         <w:pStyle w:val="Heading1"/>
         <w:pBdr>
           <w:bottom w:val="single" w:color="1F3A5F" w:sz="6" w:space="4"/>
@@ -3793,7 +3878,15 @@
           <w:bCs/>
           <w:color w:val="1F3A5F"/>
         </w:rPr>
-        <w:t xml:space="preserve">10. Troubleshooting &amp; FAQ</w:t>
+        <w:t xml:space="preserve">10. AI Learning: Training and Using Your Own Sky Model</w:t>
+      </w:r>
+    </w:p>
+    <w:p>
+      <w:pPr>
+        <w:spacing w:after="160" w:line="300"/>
+      </w:pPr>
+      <w:r>
+        <w:t xml:space="preserve">This is entirely optional, and everything about it defaults to off. It exists for one reason: the fixed clear-sky-delta threshold Section 5.2 sets is a single number that does not know about your local humidity or the season, so its accuracy can drift over the year. AI Learning lets you build a model from your own camera and your own judgement instead, and try it out safely alongside the existing checks before ever relying on it.</w:t>
       </w:r>
     </w:p>
     <w:p>
@@ -3807,15 +3900,15 @@
           <w:bCs/>
           <w:color w:val="2F6F4E"/>
         </w:rPr>
-        <w:t xml:space="preserve">A sensor reads "N/A" with a red "Disconnected" tag</w:t>
-      </w:r>
-    </w:p>
-    <w:p>
-      <w:pPr>
-        <w:spacing w:after="160" w:line="300"/>
-      </w:pPr>
-      <w:r>
-        <w:t xml:space="preserve">That sensor hasn't reported a fresh reading recently (it stops being considered "fresh" after 30 seconds by default) — check its wiring, and confirm it's enabled under Settings → Hardware Pins. The dashboard also keeps showing the last known good reading in a lighter line underneath, so you don't lose the last real value.</w:t>
+        <w:t xml:space="preserve">Step 1 — Capture training data</w:t>
+      </w:r>
+    </w:p>
+    <w:p>
+      <w:pPr>
+        <w:spacing w:after="160" w:line="300"/>
+      </w:pPr>
+      <w:r>
+        <w:t xml:space="preserve">Turn on Enable AI Learning data capture under Settings → AI Learning (Section 5.9), with All Sky Camera already enabled and pointed at a real image. Every capture interval (15 minutes by default), the service saves the current raw All Sky frame together with a full sensor snapshot — outside/box temperature and humidity, rain state, and the MLX90614's raw sky/ambient/delta numbers — into an ai_training/ folder next to the service file. Nothing is used for anything yet at this point; this step only builds up a stock of images to classify.</w:t>
       </w:r>
     </w:p>
     <w:p>
@@ -3829,15 +3922,15 @@
           <w:bCs/>
           <w:color w:val="2F6F4E"/>
         </w:rPr>
-        <w:t xml:space="preserve">Startup log shows "... init failed ... continuing without it"</w:t>
-      </w:r>
-    </w:p>
-    <w:p>
-      <w:pPr>
-        <w:spacing w:after="160" w:line="300"/>
-      </w:pPr>
-      <w:r>
-        <w:t xml:space="preserve">This is expected and not fatal — a sensor that fails to initialize at startup (nothing wired to that I2C address, for example) is caught, logged, and skipped; that reading just shows N/A until the wiring is fixed and the service is restarted.</w:t>
+        <w:t xml:space="preserve">Step 2 — Classify what you captured</w:t>
+      </w:r>
+    </w:p>
+    <w:p>
+      <w:pPr>
+        <w:spacing w:after="160" w:line="300"/>
+      </w:pPr>
+      <w:r>
+        <w:t xml:space="preserve">Open the Classify page from the link on the dashboard (or Settings → AI Learning), which shows your captured frames as a grid of thumbnails, oldest first. Select one or more that look alike (a run of clear frames from the same night, for example) and click the matching label button — it applies to every selected image at once, so a whole night's worth can be classified in a few clicks rather than one at a time. The label buttons come from the classification labels list in Section 5.9.</w:t>
       </w:r>
     </w:p>
     <w:p>
@@ -3851,15 +3944,15 @@
           <w:bCs/>
           <w:color w:val="2F6F4E"/>
         </w:rPr>
-        <w:t xml:space="preserve">The Restart Service / Reboot Pi buttons don't do anything</w:t>
-      </w:r>
-    </w:p>
-    <w:p>
-      <w:pPr>
-        <w:spacing w:after="160" w:line="300"/>
-      </w:pPr>
-      <w:r>
-        <w:t xml:space="preserve">They need the one-time passwordless-sudo setup described in Section 3, Step 6. Without it, the underlying systemctl command is refused silently from the web page's point of view.</w:t>
+        <w:t xml:space="preserve">Step 3 — Train a model</w:t>
+      </w:r>
+    </w:p>
+    <w:p>
+      <w:pPr>
+        <w:spacing w:after="160" w:line="300"/>
+      </w:pPr>
+      <w:r>
+        <w:t xml:space="preserve">Training needs at least 5 classified samples in each of at least 2 different labels (for example, 5+ Clear and 5+ Cloudy) — below that, the Classify page's Train model now button refuses with a message naming exactly which label needs more data, rather than producing a model that cannot really tell classes apart. Once trained, the model's prediction appears as a read-only line on the Safety Monitor card (“Model prediction: Clear”, for example), clearly marked as informational only — it does not affect SAFE/UNSAFE yet at this point, however long it's left running. Re-classify more images and click Train model now again any time to retrain it from your growing, curated set.</w:t>
       </w:r>
     </w:p>
     <w:p>
@@ -3873,15 +3966,93 @@
           <w:bCs/>
           <w:color w:val="2F6F4E"/>
         </w:rPr>
-        <w:t xml:space="preserve">My ASCOM client doesn't see the devices</w:t>
-      </w:r>
-    </w:p>
-    <w:p>
-      <w:pPr>
-        <w:spacing w:after="160" w:line="300"/>
-      </w:pPr>
-      <w:r>
-        <w:t xml:space="preserve">Confirm the service is running ("sudo systemctl status dome-safety.service"), that the client machine can reach the Pi's IP address, and that nothing on the network is blocking UDP port 32227 (discovery) or TCP port 11112 (the API itself).</w:t>
+        <w:t xml:space="preserve">Step 4 — Turn it into a real check, when you're ready</w:t>
+      </w:r>
+    </w:p>
+    <w:p>
+      <w:pPr>
+        <w:spacing w:after="160" w:line="300"/>
+      </w:pPr>
+      <w:r>
+        <w:t xml:space="preserve">Only once you've watched that informational prediction against reality for a while and trust it, check Use the trained model in the SAFE/UNSAFE decision under Settings → AI Learning. This adds the fifth SafetyMonitor check from Section 1: a prediction not in Predicted labels that count as SAFE (just Clear, by default) vetoes SAFE the same way any other failing check does.</w:t>
+      </w:r>
+    </w:p>
+    <w:p>
+      <w:pPr>
+        <w:spacing w:after="160" w:line="300"/>
+      </w:pPr>
+      <w:r>
+        <w:t xml:space="preserve">Turning this on can never itself make the roof less safe than before it existed. Two situations fail open — behaving exactly as if the check were still off — rather than blocking SAFE or crashing:</w:t>
+      </w:r>
+    </w:p>
+    <w:p>
+      <w:pPr>
+        <w:pStyle w:val="ListParagraph"/>
+        <w:numPr>
+          <w:ilvl w:val="0"/>
+          <w:numId w:val="2"/>
+        </w:numPr>
+        <w:spacing w:after="100" w:line="280"/>
+      </w:pPr>
+      <w:r>
+        <w:rPr>
+          <w:b/>
+          <w:bCs/>
+        </w:rPr>
+        <w:t xml:space="preserve">No trained model yet</w:t>
+      </w:r>
+      <w:r>
+        <w:t xml:space="preserve"> — the check is on, but Step 3 above hasn't been done (or the model file has gone missing/corrupt).</w:t>
+      </w:r>
+    </w:p>
+    <w:p>
+      <w:pPr>
+        <w:pStyle w:val="ListParagraph"/>
+        <w:numPr>
+          <w:ilvl w:val="0"/>
+          <w:numId w:val="2"/>
+        </w:numPr>
+        <w:spacing w:after="100" w:line="280"/>
+      </w:pPr>
+      <w:r>
+        <w:rPr>
+          <w:b/>
+          <w:bCs/>
+        </w:rPr>
+        <w:t xml:space="preserve">No fresh reading to predict from</w:t>
+      </w:r>
+      <w:r>
+        <w:t xml:space="preserve"> — a valid model exists, but none of the sensors it needs have a recent enough reading at this exact moment.</w:t>
+      </w:r>
+    </w:p>
+    <w:p>
+      <w:pPr>
+        <w:spacing w:after="160" w:line="300"/>
+      </w:pPr>
+      <w:r>
+        <w:t xml:space="preserve">Neither case is silent: a banner appears at the top of the dashboard, an inline warning row appears on the Safety Monitor card itself, a matching note appears on the Classify page, and an Event Log entry is written the moment either state actually begins — not repeated every poll cycle. See “The dashboard shows a banner about the AI Model gate” under Troubleshooting (Section 11) if you see one of these and aren't sure why.</w:t>
+      </w:r>
+    </w:p>
+    <w:p>
+      <w:r>
+        <w:br w:type="page"/>
+      </w:r>
+    </w:p>
+    <w:p>
+      <w:pPr>
+        <w:pStyle w:val="Heading1"/>
+        <w:pBdr>
+          <w:bottom w:val="single" w:color="1F3A5F" w:sz="6" w:space="4"/>
+        </w:pBdr>
+        <w:spacing w:after="200" w:before="480"/>
+      </w:pPr>
+      <w:r>
+        <w:rPr>
+          <w:b/>
+          <w:bCs/>
+          <w:color w:val="1F3A5F"/>
+        </w:rPr>
+        <w:t xml:space="preserve">11. Troubleshooting &amp; FAQ</w:t>
       </w:r>
     </w:p>
     <w:p>
@@ -3895,15 +4066,15 @@
           <w:bCs/>
           <w:color w:val="2F6F4E"/>
         </w:rPr>
-        <w:t xml:space="preserve">I renamed a device under ASCOM Device Names — will my client need reconfiguring?</w:t>
-      </w:r>
-    </w:p>
-    <w:p>
-      <w:pPr>
-        <w:spacing w:after="160" w:line="300"/>
-      </w:pPr>
-      <w:r>
-        <w:t xml:space="preserve">No. The rename only changes the display name a client shows in its device chooser; it never changes that device's UniqueID, which is what a client actually uses to remember "this is the same device I configured before." Most clients only re-read the chooser list occasionally, so the new name may not appear there until the client itself refreshes it.</w:t>
+        <w:t xml:space="preserve">A sensor reads "N/A" with a red "Disconnected" tag</w:t>
+      </w:r>
+    </w:p>
+    <w:p>
+      <w:pPr>
+        <w:spacing w:after="160" w:line="300"/>
+      </w:pPr>
+      <w:r>
+        <w:t xml:space="preserve">That sensor hasn't reported a fresh reading recently (it stops being considered "fresh" after 30 seconds by default) — check its wiring, and confirm it's enabled under Settings → Hardware Pins. The dashboard also keeps showing the last known good reading in a lighter line underneath, so you don't lose the last real value.</w:t>
       </w:r>
     </w:p>
     <w:p>
@@ -3917,6 +4088,94 @@
           <w:bCs/>
           <w:color w:val="2F6F4E"/>
         </w:rPr>
+        <w:t xml:space="preserve">Startup log shows "... init failed ... continuing without it"</w:t>
+      </w:r>
+    </w:p>
+    <w:p>
+      <w:pPr>
+        <w:spacing w:after="160" w:line="300"/>
+      </w:pPr>
+      <w:r>
+        <w:t xml:space="preserve">This is expected and not fatal — a sensor that fails to initialize at startup (nothing wired to that I2C address, for example) is caught, logged, and skipped; that reading just shows N/A until the wiring is fixed and the service is restarted.</w:t>
+      </w:r>
+    </w:p>
+    <w:p>
+      <w:pPr>
+        <w:pStyle w:val="Heading3"/>
+        <w:spacing w:after="100" w:before="220"/>
+      </w:pPr>
+      <w:r>
+        <w:rPr>
+          <w:b/>
+          <w:bCs/>
+          <w:color w:val="2F6F4E"/>
+        </w:rPr>
+        <w:t xml:space="preserve">The Restart Service / Reboot Pi buttons don't do anything</w:t>
+      </w:r>
+    </w:p>
+    <w:p>
+      <w:pPr>
+        <w:spacing w:after="160" w:line="300"/>
+      </w:pPr>
+      <w:r>
+        <w:t xml:space="preserve">They need the one-time passwordless-sudo setup described in Section 3, Step 6. Without it, the underlying systemctl command is refused silently from the web page's point of view.</w:t>
+      </w:r>
+    </w:p>
+    <w:p>
+      <w:pPr>
+        <w:pStyle w:val="Heading3"/>
+        <w:spacing w:after="100" w:before="220"/>
+      </w:pPr>
+      <w:r>
+        <w:rPr>
+          <w:b/>
+          <w:bCs/>
+          <w:color w:val="2F6F4E"/>
+        </w:rPr>
+        <w:t xml:space="preserve">My ASCOM client doesn't see the devices</w:t>
+      </w:r>
+    </w:p>
+    <w:p>
+      <w:pPr>
+        <w:spacing w:after="160" w:line="300"/>
+      </w:pPr>
+      <w:r>
+        <w:t xml:space="preserve">Confirm the service is running ("sudo systemctl status dome-safety.service"), that the client machine can reach the Pi's IP address, and that nothing on the network is blocking UDP port 32227 (discovery) or TCP port 11112 (the API itself).</w:t>
+      </w:r>
+    </w:p>
+    <w:p>
+      <w:pPr>
+        <w:pStyle w:val="Heading3"/>
+        <w:spacing w:after="100" w:before="220"/>
+      </w:pPr>
+      <w:r>
+        <w:rPr>
+          <w:b/>
+          <w:bCs/>
+          <w:color w:val="2F6F4E"/>
+        </w:rPr>
+        <w:t xml:space="preserve">I renamed a device under ASCOM Device Names — will my client need reconfiguring?</w:t>
+      </w:r>
+    </w:p>
+    <w:p>
+      <w:pPr>
+        <w:spacing w:after="160" w:line="300"/>
+      </w:pPr>
+      <w:r>
+        <w:t xml:space="preserve">No. The rename only changes the display name a client shows in its device chooser; it never changes that device's UniqueID, which is what a client actually uses to remember "this is the same device I configured before." Most clients only re-read the chooser list occasionally, so the new name may not appear there until the client itself refreshes it.</w:t>
+      </w:r>
+    </w:p>
+    <w:p>
+      <w:pPr>
+        <w:pStyle w:val="Heading3"/>
+        <w:spacing w:after="100" w:before="220"/>
+      </w:pPr>
+      <w:r>
+        <w:rPr>
+          <w:b/>
+          <w:bCs/>
+          <w:color w:val="2F6F4E"/>
+        </w:rPr>
         <w:t xml:space="preserve">I set the Extra Text File path but Allsky isn't showing my sensor readings</w:t>
       </w:r>
     </w:p>
@@ -3926,6 +4185,50 @@
       </w:pPr>
       <w:r>
         <w:t xml:space="preserve">Check three things. First, the exact same full path must be entered in both places — this service's Settings → All Sky Camera → Extra Text File path, and Allsky's own Settings → Overlay → "Extra Text File" field. Second, that path has to match where dome_safety_service.py actually runs from on your Pi — run "sudo systemctl status dome-safety.service" if you're not sure of the real folder (a common gotcha: this service's default path assumes a "pi" login user, but your Pi may use a different one, e.g. admin, which changes the home directory). Third, the service has to have been restarted since you set the path ("sudo systemctl restart dome-safety.service"). You can confirm the file itself is updating by running "cat &lt;the path&gt;" directly on the Pi — its first line (a timestamp) should advance every couple of seconds.</w:t>
+      </w:r>
+    </w:p>
+    <w:p>
+      <w:pPr>
+        <w:pStyle w:val="Heading3"/>
+        <w:spacing w:after="100" w:before="220"/>
+      </w:pPr>
+      <w:r>
+        <w:rPr>
+          <w:b/>
+          <w:bCs/>
+          <w:color w:val="2F6F4E"/>
+        </w:rPr>
+        <w:t xml:space="preserve">I don't see a Model prediction on the Safety Monitor card</w:t>
+      </w:r>
+    </w:p>
+    <w:p>
+      <w:pPr>
+        <w:spacing w:after="160" w:line="300"/>
+      </w:pPr>
+      <w:r>
+        <w:t xml:space="preserve">That line only appears once a model has actually been trained — it stays hidden entirely until then, not shown as blank or N/A. Check Settings → AI Learning (Section 5.9) for the current sample count, classify enough of them on the Classify page (at least 5 per label, at least 2 labels), and click Train model now there.</w:t>
+      </w:r>
+    </w:p>
+    <w:p>
+      <w:pPr>
+        <w:pStyle w:val="Heading3"/>
+        <w:spacing w:after="100" w:before="220"/>
+      </w:pPr>
+      <w:r>
+        <w:rPr>
+          <w:b/>
+          <w:bCs/>
+          <w:color w:val="2F6F4E"/>
+        </w:rPr>
+        <w:t xml:space="preserve">The dashboard shows a banner about the AI Model gate</w:t>
+      </w:r>
+    </w:p>
+    <w:p>
+      <w:pPr>
+        <w:spacing w:after="160" w:line="300"/>
+      </w:pPr>
+      <w:r>
+        <w:t xml:space="preserve">This means Use the trained model in the SAFE/UNSAFE decision is checked under Settings → AI Learning, but the check currently has nothing to work with — either no model has been trained yet, or none of the sensors it needs have a fresh reading right this moment. Either way it is failing open (see Section 10, Step 4): the roof is being judged by the other four checks exactly as if this one were off, not blocked by it. The banner clears itself as soon as a valid model exists and has fresh data to predict from.</w:t>
       </w:r>
     </w:p>
     <w:p>
@@ -4255,6 +4558,54 @@
                 <w:szCs w:val="20"/>
               </w:rPr>
               <w:t xml:space="preserve">logs/images/, next to the service file</w:t>
+            </w:r>
+          </w:p>
+        </w:tc>
+      </w:tr>
+      <w:tr>
+        <w:tc>
+          <w:tcPr>
+            <w:tcW w:type="dxa" w:w="3200"/>
+            <w:tcMar>
+              <w:top w:type="dxa" w:w="80"/>
+              <w:left w:type="dxa" w:w="120"/>
+              <w:bottom w:type="dxa" w:w="80"/>
+              <w:right w:type="dxa" w:w="120"/>
+            </w:tcMar>
+          </w:tcPr>
+          <w:p>
+            <w:r>
+              <w:rPr>
+                <w:b w:val="false"/>
+                <w:bCs w:val="false"/>
+                <w:color w:val="222222"/>
+                <w:sz w:val="20"/>
+                <w:szCs w:val="20"/>
+              </w:rPr>
+              <w:t xml:space="preserve">AI Learning data</w:t>
+            </w:r>
+          </w:p>
+        </w:tc>
+        <w:tc>
+          <w:tcPr>
+            <w:tcW w:type="dxa" w:w="6160"/>
+            <w:tcMar>
+              <w:top w:type="dxa" w:w="80"/>
+              <w:left w:type="dxa" w:w="120"/>
+              <w:bottom w:type="dxa" w:w="80"/>
+              <w:right w:type="dxa" w:w="120"/>
+            </w:tcMar>
+          </w:tcPr>
+          <w:p>
+            <w:r>
+              <w:rPr>
+                <w:b w:val="false"/>
+                <w:bCs w:val="false"/>
+                <w:color w:val="222222"/>
+                <w:sz w:val="20"/>
+                <w:szCs w:val="20"/>
+              </w:rPr>
+              <w:t xml:space="preserve">ai_training/ (captured images, index.json, and sky_model.json once trained), next to the service file</w:t>
             </w:r>
           </w:p>
         </w:tc>

</xml_diff>

<commit_message>
Update README, setup guide, and preview snapshot for Sky History
- README: document the Sky History card (compact hourly time axis,
  date-under-midnight) and the sensor-polling loop's per-cycle timeout
  + exception hardening added earlier this session.
- Observatory_Setup_Guide.docx: add a "Sky History" section after the
  All Sky card (Figure 5), and a new FAQ entry explaining the
  "no model downloaded yet" Cloud Image Model status bug that was
  fixed this session.
- preview_index.html: regenerate via app.test_client() against a
  populated demo sensor_state so the static reference snapshot
  actually shows the Sky History card and the new compact time axis,
  instead of predating the feature entirely.

Co-Authored-By: Claude Sonnet 5 <noreply@anthropic.com>
Claude-Session: https://claude.ai/code/session_01BoDyn1TXaNEhBU2sENEj1a
</commit_message>
<xml_diff>
--- a/Observatory_Setup_Guide.docx
+++ b/Observatory_Setup_Guide.docx
@@ -2592,6 +2592,28 @@
       </w:r>
     </w:p>
     <w:p>
+      <w:pPr>
+        <w:pStyle w:val="Heading2"/>
+        <w:spacing w:after="140" w:before="340"/>
+      </w:pPr>
+      <w:r>
+        <w:rPr>
+          <w:b/>
+          <w:bCs/>
+          <w:color w:val="1F3A5F"/>
+        </w:rPr>
+        <w:t xml:space="preserve">Sky History</w:t>
+      </w:r>
+    </w:p>
+    <w:p>
+      <w:pPr>
+        <w:spacing w:after="160" w:line="300"/>
+      </w:pPr>
+      <w:r>
+        <w:t xml:space="preserve">Sits beside the All Sky card once a trained AI Model exists and there have been at least a couple of logged readings in the last 48 hours — a scrollable chart of the AI Sky Prediction’s corrected-delta value over that window, split into three colour bands (Overcast / Cloudy / Clear) so you can see at a glance how the sky has been trending, not just what it is right now. A red “Now” marker pins the live prediction at the left edge of the chart, with the trace continuing further right the further back in time you scroll. The time axis along the bottom labels every hour in a compact “3:00AM”-style format, and shows the calendar date on a second line under every 12:00AM tick, so a 48-hour trace that crosses midnight stays unambiguous about which day each half belongs to. With All Sky turned off, this card (if it has anything to show yet) just appears as a normal grid item alongside Dome and Heater instead of sitting next to the camera feed.</w:t>
+      </w:r>
+    </w:p>
+    <w:p>
       <w:r>
         <w:br w:type="page"/>
       </w:r>
@@ -4590,6 +4612,28 @@
       </w:pPr>
       <w:r>
         <w:t xml:space="preserve">The model's current prediction is your configured “Ignore” label (Settings → AI Learning → classification labels) — the check is holding its last real prediction (shown in parentheses) rather than reacting to this frame, exactly as designed. This clears on its own once the model predicts something other than Ignore again.</w:t>
+      </w:r>
+    </w:p>
+    <w:p>
+      <w:pPr>
+        <w:pStyle w:val="Heading3"/>
+        <w:spacing w:after="100" w:before="220"/>
+      </w:pPr>
+      <w:r>
+        <w:rPr>
+          <w:b/>
+          <w:bCs/>
+          <w:color w:val="2F6F4E"/>
+        </w:rPr>
+        <w:t xml:space="preserve">The Cloud Image Model says “no model has been downloaded yet” even though I trained one</w:t>
+      </w:r>
+    </w:p>
+    <w:p>
+      <w:pPr>
+        <w:spacing w:after="160" w:line="300"/>
+      </w:pPr>
+      <w:r>
+        <w:t xml:space="preserve">Check the Classify page first to confirm the model files really did finish downloading to the Pi. If they did, this message can still show right after a service restart if every frame the model has seen so far happens to be your “Ignore” label (glare, an obstruction, etc.) — with nothing non-Ignore yet to “freeze” at, the row used to get stuck showing the same “no model downloaded” text a genuinely missing model would show, even though the model was active and running the whole time. This is fixed: the row now correctly shows plain “Ignore” in that situation instead, and clears to a normal prediction as soon as the live frame stops being classified Ignore.</w:t>
       </w:r>
     </w:p>
     <w:p>

</xml_diff>

<commit_message>
some ui changes and graph update
</commit_message>
<xml_diff>
--- a/Observatory_Setup_Guide.docx
+++ b/Observatory_Setup_Guide.docx
@@ -2602,15 +2602,15 @@
           <w:bCs/>
           <w:color w:val="1F3A5F"/>
         </w:rPr>
-        <w:t xml:space="preserve">Sky History</w:t>
-      </w:r>
-    </w:p>
-    <w:p>
-      <w:pPr>
-        <w:spacing w:after="160" w:line="300"/>
-      </w:pPr>
-      <w:r>
-        <w:t xml:space="preserve">Sits beside the All Sky card once a trained AI Model exists and there have been at least a couple of logged readings in the last 48 hours — a scrollable chart of the AI Sky Prediction’s corrected-delta value over that window, split into three colour bands (Overcast / Cloudy / Clear) so you can see at a glance how the sky has been trending, not just what it is right now. A red “Now” marker pins the live prediction at the left edge of the chart, with the trace continuing further right the further back in time you scroll. The time axis along the bottom labels every hour in a compact “3:00AM”-style format, and shows the calendar date on a second line under every 12:00AM tick, so a 48-hour trace that crosses midnight stays unambiguous about which day each half belongs to. With All Sky turned off, this card (if it has anything to show yet) just appears as a normal grid item alongside Dome and Heater instead of sitting next to the camera feed.</w:t>
+        <w:t xml:space="preserve">Safety Checks History</w:t>
+      </w:r>
+    </w:p>
+    <w:p>
+      <w:pPr>
+        <w:spacing w:after="160" w:line="300"/>
+      </w:pPr>
+      <w:r>
+        <w:t xml:space="preserve">Sits beside the All Sky card and lines every safety check up on one shared 48-hour time axis, so you can see not just what the sky is doing right now but why the Safety Monitor was SAFE or UNSAFE at any moment. The top lane is Overall (SAFE / UNSAFE); below it is one coloured lane each for Dome, Day / Night, Rain, MLX Cloud and ML Cloud, then one tall chart showing the AI Sky Prediction (solid dark line, from the sensor model) and AI Cloud Detect (dashed blue line, from the image model) over the same three Overcast / Cloudy / Clear colour bands so you can see where the two AI models agree or disagree (the chart’s labels read “AI Sky Pred.” and “AI Cloud Detect” beside their current values). If you prefer, Settings → Safety Checks → “AI graph style” switches these to two plain Clear / Cloudy / Overcast block lanes like the other checks. The Dome lane shows Open (blue), Closed (grey) and Opening / Closing (lavender), with a ▲ marker for every open and a ▼ marker for every close; each marker’s tooltip names what triggered it (Manual, ASCOM, Schedule, Safety auto-close, Safety auto-open or Rain auto-close) and a dashed line runs down through every lane at that moment, so you can see what each check was doing when the dome moved. The blank strip to the left of the red “Now” line shows every lane’s current value as a coloured pill. The colours are the same green, amber and red used by the original Sky History bands; grey means a check had no usable reading (which counts as UNSAFE). A lane only appears while its own switch under Settings → Safety Checks is on, and the AI chart disappears when both AI checks are off; the Dome lane follows Settings → Dome &amp; Heater → “Show dome open/close actions in graph” (and Dome control being on). Overall is always shown. Hover anywhere on the chart to see every check’s value at that moment; older history is further right as you scroll. The time axis labels every hour in a compact “3:00AM”-style format, with the calendar date on a second line under every 12:00AM tick. The service records one history point a minute (kept for about two days in safety_history.jsonl) and every dome open/close in dome_events.jsonl, both next to the program, so the lanes fill in from the moment this feature was installed; only the AI Sky Prediction line also reaches further back, using the samples AI Learning has already captured. A blank stretch means the service wasn’t running then. With All Sky turned off, this card just appears as a normal grid item alongside Dome and Heater. Every notice banner on the dashboard has an X to close it; closed notices are remembered in your browser and a “dismissed — Show all” link brings them back (a notice reappears by itself if its wording changes).</w:t>
       </w:r>
     </w:p>
     <w:p>
@@ -2640,7 +2640,7 @@
         <w:spacing w:after="160" w:line="300"/>
       </w:pPr>
       <w:r>
-        <w:t xml:space="preserve">Every Settings section below is safe to leave at its defaults and come back to later — nothing here is required just to get the dashboard running.</w:t>
+        <w:t xml:space="preserve">Settings has its own page (the “Settings” tab at the top of the dashboard, or /settings); a menu on the left shows one section at a time, and every “Settings” link or save returns you to the right section. Every Settings section below is safe to leave at its defaults and come back to later — nothing here is required just to get the dashboard running.</w:t>
       </w:r>
     </w:p>
     <w:p>
@@ -2892,7 +2892,7 @@
         <w:spacing w:after="160" w:line="300"/>
       </w:pPr>
       <w:r>
-        <w:t xml:space="preserve">Dome &amp; Heater are master on/off switches for each whole subsystem — turn one off if you don't have that hardware at all (e.g. no motorized roof). All Sky Camera points the dashboard at your camera's latest frame, either a local file path on the Pi or an http(s):// URL from another device's own all-sky web server. Two more All Sky fields feed a sensor-info overlay onto the image: the Extra Text File path, where this service writes the current readings (one per line) every poll cycle — paste the exact same path into Allsky's own Settings → Overlay → "Extra Text File" field so Allsky bakes them into every frame it captures — and a checkbox to skip this service's own drawn overlay once Allsky's is doing that job, so you don't end up with two overlapping info boxes.</w:t>
+        <w:t xml:space="preserve">Dome &amp; Heater are master on/off switches for each whole subsystem — turn one off if you don't have that hardware at all (e.g. no motorized roof). Under Dome control, “Show dome open/close actions in graph” adds or removes the Dome lane and its ▲/▼ markers on the Safety Checks History chart; turning it off only hides them, so the history is still there if you turn it back on. All Sky Camera points the dashboard at your camera's latest frame, either a local file path on the Pi or an http(s):// URL from another device's own all-sky web server. Two more All Sky fields feed a sensor-info overlay onto the image: the Extra Text File path, where this service writes the current readings (one per line) every poll cycle — paste the exact same path into Allsky's own Settings → Overlay → "Extra Text File" field so Allsky bakes them into every frame it captures — and a checkbox to skip this service's own drawn overlay once Allsky's is doing that job, so you don't end up with two overlapping info boxes.</w:t>
       </w:r>
     </w:p>
     <w:p>

</xml_diff>